<commit_message>
Relatório: corrige a segunda causa de ICSAP em crianças (asma, 159)
Co-Authored-By: Claude Opus 5.5 (1M context) <noreply@anthropic.com>
</commit_message>
<xml_diff>
--- a/relatorio/trabalho1_dw_atencao_basica_sao_carlos.docx
+++ b/relatorio/trabalho1_dw_atencao_basica_sao_carlos.docx
@@ -525,7 +525,7 @@
             </w:rPr>
             <w:fldChar w:fldCharType="separate"/>
           </w:r>
-          <w:hyperlink w:anchor="__RefHeading___Toc1722_3790495778" w:tooltip="1. Descrição do Problema">
+          <w:hyperlink w:anchor="__RefHeading___Toc1722_1680474171" w:tooltip="1. Descrição do Problema">
             <w:r>
               <w:rPr>
                 <w:rStyle w:val="IndexLink"/>
@@ -545,7 +545,7 @@
             </w:tabs>
             <w:rPr/>
           </w:pPr>
-          <w:hyperlink w:anchor="__RefHeading___Toc1724_3790495778" w:tooltip="1.1 Tema geral do trabalho">
+          <w:hyperlink w:anchor="__RefHeading___Toc1724_1680474171" w:tooltip="1.1 Tema geral do trabalho">
             <w:r>
               <w:rPr>
                 <w:rStyle w:val="IndexLink"/>
@@ -565,7 +565,7 @@
             </w:tabs>
             <w:rPr/>
           </w:pPr>
-          <w:hyperlink w:anchor="__RefHeading___Toc1726_3790495778" w:tooltip="1.2 Fontes de dados">
+          <w:hyperlink w:anchor="__RefHeading___Toc1726_1680474171" w:tooltip="1.2 Fontes de dados">
             <w:r>
               <w:rPr>
                 <w:rStyle w:val="IndexLink"/>
@@ -585,7 +585,7 @@
             </w:tabs>
             <w:rPr/>
           </w:pPr>
-          <w:hyperlink w:anchor="__RefHeading___Toc1728_3790495778" w:tooltip="1.3 Processos de negócio">
+          <w:hyperlink w:anchor="__RefHeading___Toc1728_1680474171" w:tooltip="1.3 Processos de negócio">
             <w:r>
               <w:rPr>
                 <w:rStyle w:val="IndexLink"/>
@@ -605,7 +605,7 @@
             </w:tabs>
             <w:rPr/>
           </w:pPr>
-          <w:hyperlink w:anchor="__RefHeading___Toc1730_3790495778" w:tooltip="1.4 Dimensões e seus atributos">
+          <w:hyperlink w:anchor="__RefHeading___Toc1730_1680474171" w:tooltip="1.4 Dimensões e seus atributos">
             <w:r>
               <w:rPr>
                 <w:rStyle w:val="IndexLink"/>
@@ -625,7 +625,7 @@
             </w:tabs>
             <w:rPr/>
           </w:pPr>
-          <w:hyperlink w:anchor="__RefHeading___Toc1732_3790495778" w:tooltip="1.5 Povoamento e integração dos dados">
+          <w:hyperlink w:anchor="__RefHeading___Toc1732_1680474171" w:tooltip="1.5 Povoamento e integração dos dados">
             <w:r>
               <w:rPr>
                 <w:rStyle w:val="IndexLink"/>
@@ -645,7 +645,7 @@
             </w:tabs>
             <w:rPr/>
           </w:pPr>
-          <w:hyperlink w:anchor="__RefHeading___Toc1734_3790495778" w:tooltip="1.6 Particularidades do problema">
+          <w:hyperlink w:anchor="__RefHeading___Toc1734_1680474171" w:tooltip="1.6 Particularidades do problema">
             <w:r>
               <w:rPr>
                 <w:rStyle w:val="IndexLink"/>
@@ -665,7 +665,7 @@
             </w:tabs>
             <w:rPr/>
           </w:pPr>
-          <w:hyperlink w:anchor="__RefHeading___Toc1736_3790495778" w:tooltip="2. Esquemas">
+          <w:hyperlink w:anchor="__RefHeading___Toc1736_1680474171" w:tooltip="2. Esquemas">
             <w:r>
               <w:rPr>
                 <w:rStyle w:val="IndexLink"/>
@@ -685,7 +685,7 @@
             </w:tabs>
             <w:rPr/>
           </w:pPr>
-          <w:hyperlink w:anchor="__RefHeading___Toc1738_3790495778" w:tooltip="2.1 Esquema estrela 1 – Oferta de equipes (fato sem fato)">
+          <w:hyperlink w:anchor="__RefHeading___Toc1738_1680474171" w:tooltip="2.1 Esquema estrela 1 – Oferta de equipes (fato sem fato)">
             <w:r>
               <w:rPr>
                 <w:rStyle w:val="IndexLink"/>
@@ -705,7 +705,7 @@
             </w:tabs>
             <w:rPr/>
           </w:pPr>
-          <w:hyperlink w:anchor="__RefHeading___Toc1740_3790495778" w:tooltip="2.2 Esquema estrela 2 – Internações hospitalares">
+          <w:hyperlink w:anchor="__RefHeading___Toc1740_1680474171" w:tooltip="2.2 Esquema estrela 2 – Internações hospitalares">
             <w:r>
               <w:rPr>
                 <w:rStyle w:val="IndexLink"/>
@@ -725,7 +725,7 @@
             </w:tabs>
             <w:rPr/>
           </w:pPr>
-          <w:hyperlink w:anchor="__RefHeading___Toc1742_3790495778" w:tooltip="2.3 Esquema estrela 3 – Produção ambulatorial">
+          <w:hyperlink w:anchor="__RefHeading___Toc1742_1680474171" w:tooltip="2.3 Esquema estrela 3 – Produção ambulatorial">
             <w:r>
               <w:rPr>
                 <w:rStyle w:val="IndexLink"/>
@@ -745,7 +745,7 @@
             </w:tabs>
             <w:rPr/>
           </w:pPr>
-          <w:hyperlink w:anchor="__RefHeading___Toc1744_3790495778" w:tooltip="2.4 Aspectos adicionais de modelagem">
+          <w:hyperlink w:anchor="__RefHeading___Toc1744_1680474171" w:tooltip="2.4 Aspectos adicionais de modelagem">
             <w:r>
               <w:rPr>
                 <w:rStyle w:val="IndexLink"/>
@@ -765,7 +765,7 @@
             </w:tabs>
             <w:rPr/>
           </w:pPr>
-          <w:hyperlink w:anchor="__RefHeading___Toc1746_3790495778" w:tooltip="2.5 Constelação de fatos">
+          <w:hyperlink w:anchor="__RefHeading___Toc1746_1680474171" w:tooltip="2.5 Constelação de fatos">
             <w:r>
               <w:rPr>
                 <w:rStyle w:val="IndexLink"/>
@@ -785,7 +785,7 @@
             </w:tabs>
             <w:rPr/>
           </w:pPr>
-          <w:hyperlink w:anchor="__RefHeading___Toc1748_3790495778" w:tooltip="3. Consultas">
+          <w:hyperlink w:anchor="__RefHeading___Toc1748_1680474171" w:tooltip="3. Consultas">
             <w:r>
               <w:rPr>
                 <w:rStyle w:val="IndexLink"/>
@@ -805,7 +805,7 @@
             </w:tabs>
             <w:rPr/>
           </w:pPr>
-          <w:hyperlink w:anchor="__RefHeading___Toc1750_3790495778" w:tooltip="Consulta 1 – Roll-up">
+          <w:hyperlink w:anchor="__RefHeading___Toc1750_1680474171" w:tooltip="Consulta 1 – Roll-up">
             <w:r>
               <w:rPr>
                 <w:rStyle w:val="IndexLink"/>
@@ -825,7 +825,7 @@
             </w:tabs>
             <w:rPr/>
           </w:pPr>
-          <w:hyperlink w:anchor="__RefHeading___Toc1752_3790495778" w:tooltip="Consulta 2 – Drill-down">
+          <w:hyperlink w:anchor="__RefHeading___Toc1752_1680474171" w:tooltip="Consulta 2 – Drill-down">
             <w:r>
               <w:rPr>
                 <w:rStyle w:val="IndexLink"/>
@@ -845,7 +845,7 @@
             </w:tabs>
             <w:rPr/>
           </w:pPr>
-          <w:hyperlink w:anchor="__RefHeading___Toc1754_3790495778" w:tooltip="Consulta 3 – Slice and dice">
+          <w:hyperlink w:anchor="__RefHeading___Toc1754_1680474171" w:tooltip="Consulta 3 – Slice and dice">
             <w:r>
               <w:rPr>
                 <w:rStyle w:val="IndexLink"/>
@@ -865,7 +865,7 @@
             </w:tabs>
             <w:rPr/>
           </w:pPr>
-          <w:hyperlink w:anchor="__RefHeading___Toc1756_3790495778" w:tooltip="Consulta 4 – Pivot">
+          <w:hyperlink w:anchor="__RefHeading___Toc1756_1680474171" w:tooltip="Consulta 4 – Pivot">
             <w:r>
               <w:rPr>
                 <w:rStyle w:val="IndexLink"/>
@@ -885,7 +885,7 @@
             </w:tabs>
             <w:rPr/>
           </w:pPr>
-          <w:hyperlink w:anchor="__RefHeading___Toc1758_3790495778" w:tooltip="Consulta 5 – Drill-across">
+          <w:hyperlink w:anchor="__RefHeading___Toc1758_1680474171" w:tooltip="Consulta 5 – Drill-across">
             <w:r>
               <w:rPr>
                 <w:rStyle w:val="IndexLink"/>
@@ -905,7 +905,7 @@
             </w:tabs>
             <w:rPr/>
           </w:pPr>
-          <w:hyperlink w:anchor="__RefHeading___Toc1760_3790495778" w:tooltip="Resumo das consultas">
+          <w:hyperlink w:anchor="__RefHeading___Toc1760_1680474171" w:tooltip="Resumo das consultas">
             <w:r>
               <w:rPr>
                 <w:rStyle w:val="IndexLink"/>
@@ -951,7 +951,7 @@
         <w:spacing w:before="0" w:after="200"/>
         <w:rPr/>
       </w:pPr>
-      <w:bookmarkStart w:id="0" w:name="__RefHeading___Toc1722_3790495778"/>
+      <w:bookmarkStart w:id="0" w:name="__RefHeading___Toc1722_1680474171"/>
       <w:bookmarkStart w:id="1" w:name="_Toc1"/>
       <w:bookmarkEnd w:id="0"/>
       <w:r>
@@ -967,7 +967,7 @@
         <w:pStyle w:val="Heading2"/>
         <w:rPr/>
       </w:pPr>
-      <w:bookmarkStart w:id="2" w:name="__RefHeading___Toc1724_3790495778"/>
+      <w:bookmarkStart w:id="2" w:name="__RefHeading___Toc1724_1680474171"/>
       <w:bookmarkStart w:id="3" w:name="_Toc2"/>
       <w:bookmarkEnd w:id="2"/>
       <w:r>
@@ -1103,7 +1103,7 @@
         <w:pStyle w:val="Heading2"/>
         <w:rPr/>
       </w:pPr>
-      <w:bookmarkStart w:id="4" w:name="__RefHeading___Toc1726_3790495778"/>
+      <w:bookmarkStart w:id="4" w:name="__RefHeading___Toc1726_1680474171"/>
       <w:bookmarkStart w:id="5" w:name="_Toc3"/>
       <w:bookmarkEnd w:id="4"/>
       <w:r>
@@ -1752,7 +1752,7 @@
         <w:pStyle w:val="Heading2"/>
         <w:rPr/>
       </w:pPr>
-      <w:bookmarkStart w:id="6" w:name="__RefHeading___Toc1728_3790495778"/>
+      <w:bookmarkStart w:id="6" w:name="__RefHeading___Toc1728_1680474171"/>
       <w:bookmarkStart w:id="7" w:name="_Toc4"/>
       <w:bookmarkEnd w:id="6"/>
       <w:r>
@@ -2294,7 +2294,7 @@
         <w:pStyle w:val="Heading2"/>
         <w:rPr/>
       </w:pPr>
-      <w:bookmarkStart w:id="8" w:name="__RefHeading___Toc1730_3790495778"/>
+      <w:bookmarkStart w:id="8" w:name="__RefHeading___Toc1730_1680474171"/>
       <w:bookmarkStart w:id="9" w:name="_Toc5"/>
       <w:bookmarkEnd w:id="8"/>
       <w:r>
@@ -10118,7 +10118,7 @@
         <w:pStyle w:val="Heading2"/>
         <w:rPr/>
       </w:pPr>
-      <w:bookmarkStart w:id="10" w:name="__RefHeading___Toc1732_3790495778"/>
+      <w:bookmarkStart w:id="10" w:name="__RefHeading___Toc1732_1680474171"/>
       <w:bookmarkStart w:id="11" w:name="_Toc6"/>
       <w:bookmarkEnd w:id="10"/>
       <w:r>
@@ -11177,7 +11177,7 @@
         <w:pStyle w:val="Heading2"/>
         <w:rPr/>
       </w:pPr>
-      <w:bookmarkStart w:id="12" w:name="__RefHeading___Toc1734_3790495778"/>
+      <w:bookmarkStart w:id="12" w:name="__RefHeading___Toc1734_1680474171"/>
       <w:bookmarkStart w:id="13" w:name="_Toc7"/>
       <w:bookmarkEnd w:id="12"/>
       <w:r>
@@ -11392,7 +11392,7 @@
         <w:spacing w:before="0" w:after="200"/>
         <w:rPr/>
       </w:pPr>
-      <w:bookmarkStart w:id="14" w:name="__RefHeading___Toc1736_3790495778"/>
+      <w:bookmarkStart w:id="14" w:name="__RefHeading___Toc1736_1680474171"/>
       <w:bookmarkStart w:id="15" w:name="_Toc8"/>
       <w:bookmarkEnd w:id="14"/>
       <w:r>
@@ -11490,7 +11490,7 @@
         <w:pStyle w:val="Heading2"/>
         <w:rPr/>
       </w:pPr>
-      <w:bookmarkStart w:id="16" w:name="__RefHeading___Toc1738_3790495778"/>
+      <w:bookmarkStart w:id="16" w:name="__RefHeading___Toc1738_1680474171"/>
       <w:bookmarkStart w:id="17" w:name="_Toc9"/>
       <w:bookmarkEnd w:id="16"/>
       <w:r>
@@ -11927,7 +11927,7 @@
         <w:pStyle w:val="Heading2"/>
         <w:rPr/>
       </w:pPr>
-      <w:bookmarkStart w:id="18" w:name="__RefHeading___Toc1740_3790495778"/>
+      <w:bookmarkStart w:id="18" w:name="__RefHeading___Toc1740_1680474171"/>
       <w:bookmarkStart w:id="19" w:name="_Toc10"/>
       <w:bookmarkEnd w:id="18"/>
       <w:r>
@@ -12886,7 +12886,7 @@
         <w:pStyle w:val="Heading2"/>
         <w:rPr/>
       </w:pPr>
-      <w:bookmarkStart w:id="20" w:name="__RefHeading___Toc1742_3790495778"/>
+      <w:bookmarkStart w:id="20" w:name="__RefHeading___Toc1742_1680474171"/>
       <w:bookmarkStart w:id="21" w:name="_Toc11"/>
       <w:bookmarkEnd w:id="20"/>
       <w:r>
@@ -13795,7 +13795,7 @@
         <w:pStyle w:val="Heading2"/>
         <w:rPr/>
       </w:pPr>
-      <w:bookmarkStart w:id="22" w:name="__RefHeading___Toc1744_3790495778"/>
+      <w:bookmarkStart w:id="22" w:name="__RefHeading___Toc1744_1680474171"/>
       <w:bookmarkStart w:id="23" w:name="_Toc12"/>
       <w:bookmarkEnd w:id="22"/>
       <w:r>
@@ -14014,7 +14014,7 @@
         <w:spacing w:before="0" w:after="120"/>
         <w:rPr/>
       </w:pPr>
-      <w:bookmarkStart w:id="24" w:name="__RefHeading___Toc1746_3790495778"/>
+      <w:bookmarkStart w:id="24" w:name="__RefHeading___Toc1746_1680474171"/>
       <w:bookmarkStart w:id="25" w:name="_Toc13"/>
       <w:bookmarkEnd w:id="24"/>
       <w:r>
@@ -15397,7 +15397,7 @@
         <w:spacing w:before="0" w:after="200"/>
         <w:rPr/>
       </w:pPr>
-      <w:bookmarkStart w:id="26" w:name="__RefHeading___Toc1748_3790495778"/>
+      <w:bookmarkStart w:id="26" w:name="__RefHeading___Toc1748_1680474171"/>
       <w:bookmarkStart w:id="27" w:name="_Toc14"/>
       <w:bookmarkEnd w:id="26"/>
       <w:r>
@@ -15437,7 +15437,7 @@
         <w:pStyle w:val="Heading2"/>
         <w:rPr/>
       </w:pPr>
-      <w:bookmarkStart w:id="28" w:name="__RefHeading___Toc1750_3790495778"/>
+      <w:bookmarkStart w:id="28" w:name="__RefHeading___Toc1750_1680474171"/>
       <w:bookmarkStart w:id="29" w:name="_Toc15"/>
       <w:bookmarkEnd w:id="28"/>
       <w:r>
@@ -15617,7 +15617,7 @@
         <w:pStyle w:val="Heading2"/>
         <w:rPr/>
       </w:pPr>
-      <w:bookmarkStart w:id="30" w:name="__RefHeading___Toc1752_3790495778"/>
+      <w:bookmarkStart w:id="30" w:name="__RefHeading___Toc1752_1680474171"/>
       <w:bookmarkStart w:id="31" w:name="_Toc16"/>
       <w:bookmarkEnd w:id="30"/>
       <w:r>
@@ -15797,7 +15797,7 @@
         <w:pStyle w:val="Heading2"/>
         <w:rPr/>
       </w:pPr>
-      <w:bookmarkStart w:id="32" w:name="__RefHeading___Toc1754_3790495778"/>
+      <w:bookmarkStart w:id="32" w:name="__RefHeading___Toc1754_1680474171"/>
       <w:bookmarkStart w:id="33" w:name="_Toc17"/>
       <w:bookmarkEnd w:id="32"/>
       <w:r>
@@ -15977,7 +15977,7 @@
         <w:pStyle w:val="Heading2"/>
         <w:rPr/>
       </w:pPr>
-      <w:bookmarkStart w:id="34" w:name="__RefHeading___Toc1756_3790495778"/>
+      <w:bookmarkStart w:id="34" w:name="__RefHeading___Toc1756_1680474171"/>
       <w:bookmarkStart w:id="35" w:name="_Toc18"/>
       <w:bookmarkEnd w:id="34"/>
       <w:r>
@@ -16085,7 +16085,7 @@
         <w:rPr>
           <w:rFonts w:eastAsia="Times New Roman" w:cs="Times New Roman"/>
         </w:rPr>
-        <w:t xml:space="preserve"> Na primeira orientação, cada causa mostra em que fase da vida pesa: as doenças circulatórias são quase exclusivas de adultos e idosos (621 idosos com doença cerebrovascular nos dois anos). Na orientação rotacionada, cada fase da vida mostra suas causas: nas crianças predominam as doenças pulmonares (329) e as gastroenterites (79); nos adultos, as doenças cerebrovasculares (229), a infecção do rim e trato urinário (204) e a de pele e subcutâneo (189).</w:t>
+        <w:t xml:space="preserve"> Na primeira orientação, cada causa mostra em que fase da vida pesa: as doenças circulatórias são quase exclusivas de adultos e idosos (621 idosos com doença cerebrovascular nos dois anos). Na orientação rotacionada, cada fase da vida mostra suas causas: nas crianças predominam as doenças pulmonares (329) e a asma (159); nos adultos, as doenças cerebrovasculares (229), a infecção do rim e trato urinário (204) e a de pele e subcutâneo (189).</w:t>
       </w:r>
     </w:p>
     <w:p>
@@ -16157,7 +16157,7 @@
         <w:pStyle w:val="Heading2"/>
         <w:rPr/>
       </w:pPr>
-      <w:bookmarkStart w:id="36" w:name="__RefHeading___Toc1758_3790495778"/>
+      <w:bookmarkStart w:id="36" w:name="__RefHeading___Toc1758_1680474171"/>
       <w:bookmarkStart w:id="37" w:name="_Toc19"/>
       <w:bookmarkEnd w:id="36"/>
       <w:r>
@@ -16401,7 +16401,7 @@
         <w:pStyle w:val="Heading2"/>
         <w:rPr/>
       </w:pPr>
-      <w:bookmarkStart w:id="38" w:name="__RefHeading___Toc1760_3790495778"/>
+      <w:bookmarkStart w:id="38" w:name="__RefHeading___Toc1760_1680474171"/>
       <w:bookmarkStart w:id="39" w:name="_Toc20"/>
       <w:bookmarkEnd w:id="38"/>
       <w:r>

</xml_diff>